<commit_message>
Correct work history: add Forto (Berlin) and Bluemeteor contract role, refresh downloadable resumes
Co-Authored-By: Claude Opus 5.5 <noreply@anthropic.com>
</commit_message>
<xml_diff>
--- a/AnkitParekh_Resume.docx
+++ b/AnkitParekh_Resume.docx
@@ -2,1119 +2,573 @@
 <file path=word/document.xml><?xml version="1.0" encoding="utf-8"?>
 <w:document xmlns:wpc="http://schemas.microsoft.com/office/word/2010/wordprocessingCanvas" xmlns:mo="http://schemas.microsoft.com/office/mac/office/2008/main" xmlns:mc="http://schemas.openxmlformats.org/markup-compatibility/2006" xmlns:mv="urn:schemas-microsoft-com:mac:vml" xmlns:o="urn:schemas-microsoft-com:office:office" xmlns:r="http://schemas.openxmlformats.org/officeDocument/2006/relationships" xmlns:m="http://schemas.openxmlformats.org/officeDocument/2006/math" xmlns:v="urn:schemas-microsoft-com:vml" xmlns:wp14="http://schemas.microsoft.com/office/word/2010/wordprocessingDrawing" xmlns:wp="http://schemas.openxmlformats.org/drawingml/2006/wordprocessingDrawing" xmlns:w10="urn:schemas-microsoft-com:office:word" xmlns:w="http://schemas.openxmlformats.org/wordprocessingml/2006/main" xmlns:w14="http://schemas.microsoft.com/office/word/2010/wordml" xmlns:wpg="http://schemas.microsoft.com/office/word/2010/wordprocessingGroup" xmlns:wpi="http://schemas.microsoft.com/office/word/2010/wordprocessingInk" xmlns:wne="http://schemas.microsoft.com/office/word/2006/wordml" xmlns:wps="http://schemas.microsoft.com/office/word/2010/wordprocessingShape" mc:Ignorable="w14 wp14">
   <w:body>
-    <w:tbl>
-      <w:tblPr>
-        <w:tblW w:type="auto" w:w="0"/>
-        <w:tblLayout w:type="fixed"/>
-        <w:tblLook w:firstColumn="1" w:firstRow="1" w:lastColumn="0" w:lastRow="0" w:noHBand="0" w:noVBand="1" w:val="04A0"/>
-      </w:tblPr>
-      <w:tblGrid>
-        <w:gridCol w:w="2952"/>
-        <w:gridCol w:w="7344"/>
-      </w:tblGrid>
-      <w:tr>
-        <w:tc>
-          <w:tcPr>
-            <w:tcW w:type="dxa" w:w="2952"/>
-            <w:vAlign w:val="top"/>
-            <w:shd w:fill="F8FAFF"/>
-          </w:tcPr>
-          <w:p>
-            <w:pPr>
-              <w:jc w:val="center"/>
-            </w:pPr>
-            <w:r>
-              <w:rPr>
-                <w:b/>
-                <w:color w:val="0F172A"/>
-                <w:sz w:val="38"/>
-              </w:rPr>
-              <w:t>Ankit Parekh</w:t>
-            </w:r>
-          </w:p>
-          <w:p>
-            <w:pPr>
-              <w:jc w:val="center"/>
-            </w:pPr>
-            <w:r>
-              <w:rPr>
-                <w:b/>
-                <w:color w:val="4F46E5"/>
-                <w:sz w:val="18"/>
-              </w:rPr>
-              <w:t>AI Frontend Architect</w:t>
-            </w:r>
-          </w:p>
-          <w:p>
-            <w:pPr>
-              <w:jc w:val="center"/>
-            </w:pPr>
-            <w:r>
-              <w:rPr>
-                <w:color w:val="475569"/>
-                <w:sz w:val="15"/>
-              </w:rPr>
-              <w:t>Enterprise Angular | Copilots | UI Agents | LLM Apps</w:t>
-            </w:r>
-          </w:p>
-          <w:p>
-            <w:pPr>
-              <w:spacing w:before="160" w:after="40"/>
-            </w:pPr>
-            <w:r>
-              <w:rPr>
-                <w:b/>
-                <w:color w:val="4F46E5"/>
-                <w:sz w:val="19"/>
-              </w:rPr>
-              <w:t>DETAILS</w:t>
-            </w:r>
-          </w:p>
-          <w:p>
-            <w:r>
-              <w:rPr>
-                <w:color w:val="475569"/>
-                <w:sz w:val="15"/>
-              </w:rPr>
-              <w:t>Mumbai, India</w:t>
-            </w:r>
-          </w:p>
-          <w:p>
-            <w:r>
-              <w:rPr>
-                <w:color w:val="475569"/>
-                <w:sz w:val="15"/>
-              </w:rPr>
-              <w:t>Immediate joiner</w:t>
-            </w:r>
-          </w:p>
-          <w:p>
-            <w:r>
-              <w:rPr>
-                <w:color w:val="475569"/>
-                <w:sz w:val="15"/>
-              </w:rPr>
-              <w:t>Open to Germany, Ireland, and remote Europe roles</w:t>
-            </w:r>
-          </w:p>
-          <w:p>
-            <w:r>
-              <w:rPr>
-                <w:color w:val="475569"/>
-                <w:sz w:val="15"/>
-              </w:rPr>
-              <w:t>ankit77parekh@gmail.com</w:t>
-            </w:r>
-          </w:p>
-          <w:p>
-            <w:r>
-              <w:rPr>
-                <w:color w:val="475569"/>
-                <w:sz w:val="15"/>
-              </w:rPr>
-              <w:t>+91 9920353532</w:t>
-            </w:r>
-          </w:p>
-          <w:p>
-            <w:pPr>
-              <w:spacing w:before="160" w:after="40"/>
-            </w:pPr>
-            <w:r>
-              <w:rPr>
-                <w:b/>
-                <w:color w:val="4F46E5"/>
-                <w:sz w:val="19"/>
-              </w:rPr>
-              <w:t>LINKS</w:t>
-            </w:r>
-          </w:p>
-          <w:p>
-            <w:hyperlink r:id="rId9">
-              <w:r>
-                <w:rPr>
-                  <w:color w:val="FFFFFF"/>
-                  <w:u w:val="single"/>
-                </w:rPr>
-                <w:t>Portfolio</w:t>
-              </w:r>
-            </w:hyperlink>
-          </w:p>
-          <w:p>
-            <w:hyperlink r:id="rId10">
-              <w:r>
-                <w:rPr>
-                  <w:color w:val="FFFFFF"/>
-                  <w:u w:val="single"/>
-                </w:rPr>
-                <w:t>GitHub</w:t>
-              </w:r>
-            </w:hyperlink>
-          </w:p>
-          <w:p>
-            <w:hyperlink r:id="rId11">
-              <w:r>
-                <w:rPr>
-                  <w:color w:val="FFFFFF"/>
-                  <w:u w:val="single"/>
-                </w:rPr>
-                <w:t>LinkedIn</w:t>
-              </w:r>
-            </w:hyperlink>
-          </w:p>
-          <w:p>
-            <w:pPr>
-              <w:spacing w:before="160" w:after="40"/>
-            </w:pPr>
-            <w:r>
-              <w:rPr>
-                <w:b/>
-                <w:color w:val="4F46E5"/>
-                <w:sz w:val="19"/>
-              </w:rPr>
-              <w:t>SKILL FOCUS</w:t>
-            </w:r>
-          </w:p>
-          <w:p>
-            <w:r>
-              <w:rPr>
-                <w:color w:val="0F172A"/>
-                <w:sz w:val="15"/>
-              </w:rPr>
-              <w:t>Angular</w:t>
-            </w:r>
-          </w:p>
-          <w:p>
-            <w:r>
-              <w:rPr>
-                <w:color w:val="38BDF8"/>
-                <w:sz w:val="12"/>
-              </w:rPr>
-              <w:t>■■■■■■■■■□</w:t>
-            </w:r>
-          </w:p>
-          <w:p>
-            <w:r>
-              <w:rPr>
-                <w:color w:val="0F172A"/>
-                <w:sz w:val="15"/>
-              </w:rPr>
-              <w:t>TypeScript</w:t>
-            </w:r>
-          </w:p>
-          <w:p>
-            <w:r>
-              <w:rPr>
-                <w:color w:val="38BDF8"/>
-                <w:sz w:val="12"/>
-              </w:rPr>
-              <w:t>■■■■■■■■■□</w:t>
-            </w:r>
-          </w:p>
-          <w:p>
-            <w:r>
-              <w:rPr>
-                <w:color w:val="0F172A"/>
-                <w:sz w:val="15"/>
-              </w:rPr>
-              <w:t>Frontend Architecture</w:t>
-            </w:r>
-          </w:p>
-          <w:p>
-            <w:r>
-              <w:rPr>
-                <w:color w:val="38BDF8"/>
-                <w:sz w:val="12"/>
-              </w:rPr>
-              <w:t>■■■■■■■■■□</w:t>
-            </w:r>
-          </w:p>
-          <w:p>
-            <w:r>
-              <w:rPr>
-                <w:color w:val="0F172A"/>
-                <w:sz w:val="15"/>
-              </w:rPr>
-              <w:t>AI Copilots</w:t>
-            </w:r>
-          </w:p>
-          <w:p>
-            <w:r>
-              <w:rPr>
-                <w:color w:val="38BDF8"/>
-                <w:sz w:val="12"/>
-              </w:rPr>
-              <w:t>■■■■■■■■□□</w:t>
-            </w:r>
-          </w:p>
-          <w:p>
-            <w:r>
-              <w:rPr>
-                <w:color w:val="0F172A"/>
-                <w:sz w:val="15"/>
-              </w:rPr>
-              <w:t>RAG / LLM Apps</w:t>
-            </w:r>
-          </w:p>
-          <w:p>
-            <w:r>
-              <w:rPr>
-                <w:color w:val="38BDF8"/>
-                <w:sz w:val="12"/>
-              </w:rPr>
-              <w:t>■■■■■■■■□□</w:t>
-            </w:r>
-          </w:p>
-          <w:p>
-            <w:r>
-              <w:rPr>
-                <w:color w:val="0F172A"/>
-                <w:sz w:val="15"/>
-              </w:rPr>
-              <w:t>Cloud Delivery</w:t>
-            </w:r>
-          </w:p>
-          <w:p>
-            <w:r>
-              <w:rPr>
-                <w:color w:val="38BDF8"/>
-                <w:sz w:val="12"/>
-              </w:rPr>
-              <w:t>■■■■■■■□□□</w:t>
-            </w:r>
-          </w:p>
-          <w:p>
-            <w:pPr>
-              <w:spacing w:before="160" w:after="40"/>
-            </w:pPr>
-            <w:r>
-              <w:rPr>
-                <w:b/>
-                <w:color w:val="4F46E5"/>
-                <w:sz w:val="19"/>
-              </w:rPr>
-              <w:t>ROLE TARGETS</w:t>
-            </w:r>
-          </w:p>
-          <w:p>
-            <w:r>
-              <w:rPr>
-                <w:color w:val="475569"/>
-                <w:sz w:val="15"/>
-              </w:rPr>
-              <w:t>AI Frontend Engineer</w:t>
-            </w:r>
-          </w:p>
-          <w:p>
-            <w:r>
-              <w:rPr>
-                <w:color w:val="475569"/>
-                <w:sz w:val="15"/>
-              </w:rPr>
-              <w:t>Frontend Architect</w:t>
-            </w:r>
-          </w:p>
-          <w:p>
-            <w:r>
-              <w:rPr>
-                <w:color w:val="475569"/>
-                <w:sz w:val="15"/>
-              </w:rPr>
-              <w:t>Angular Architect</w:t>
-            </w:r>
-          </w:p>
-          <w:p>
-            <w:r>
-              <w:rPr>
-                <w:color w:val="475569"/>
-                <w:sz w:val="15"/>
-              </w:rPr>
-              <w:t>Copilot / LLM App Engineer</w:t>
-            </w:r>
-          </w:p>
-        </w:tc>
-        <w:tc>
-          <w:tcPr>
-            <w:tcW w:type="dxa" w:w="7344"/>
-            <w:vAlign w:val="top"/>
-            <w:shd w:fill="FFFFFF"/>
-          </w:tcPr>
-          <w:p>
-            <w:r>
-              <w:rPr>
-                <w:b/>
-                <w:color w:val="0F172A"/>
-                <w:sz w:val="44"/>
-              </w:rPr>
-              <w:t>Ankit Parekh</w:t>
-            </w:r>
-          </w:p>
-          <w:p>
-            <w:r>
-              <w:rPr>
-                <w:b/>
-                <w:color w:val="4F46E5"/>
-                <w:sz w:val="19"/>
-              </w:rPr>
-              <w:t>AI Frontend Architect - Enterprise Angular | Copilots | UI Agents | LLM Apps</w:t>
-            </w:r>
-          </w:p>
-          <w:p>
-            <w:pPr>
-              <w:spacing w:before="140" w:after="40"/>
-            </w:pPr>
-            <w:r>
-              <w:rPr>
-                <w:b/>
-                <w:color w:val="4F46E5"/>
-                <w:sz w:val="20"/>
-              </w:rPr>
-              <w:t>PROFILE</w:t>
-            </w:r>
-          </w:p>
-          <w:p>
-            <w:r>
-              <w:rPr>
-                <w:color w:val="0F172A"/>
-              </w:rPr>
-              <w:t>AI Frontend Architect with 18+ years of experience shipping enterprise web products, large Angular and TypeScript applications, and intelligent UI systems. I build AI-native frontend experiences where copilots, RAG, tool execution, and agentic workflows live inside real applications, not beside them.</w:t>
-            </w:r>
-          </w:p>
-          <w:p>
-            <w:pPr>
-              <w:pStyle w:val="ListBullet"/>
-              <w:spacing w:after="24"/>
-            </w:pPr>
-            <w:r>
-              <w:rPr>
-                <w:color w:val="0F172A"/>
-              </w:rPr>
-              <w:t>Architect large Angular platforms with clear module boundaries, reusable UI patterns, and long-term ownership.</w:t>
-            </w:r>
-          </w:p>
-          <w:p>
-            <w:pPr>
-              <w:pStyle w:val="ListBullet"/>
-              <w:spacing w:after="24"/>
-            </w:pPr>
-            <w:r>
-              <w:rPr>
-                <w:color w:val="0F172A"/>
-              </w:rPr>
-              <w:t>Design embedded copilots that understand product context, retrieve grounded answers, and execute workflow actions.</w:t>
-            </w:r>
-          </w:p>
-          <w:p>
-            <w:pPr>
-              <w:pStyle w:val="ListBullet"/>
-              <w:spacing w:after="24"/>
-            </w:pPr>
-            <w:r>
-              <w:rPr>
-                <w:color w:val="0F172A"/>
-              </w:rPr>
-              <w:t>Turn complex enterprise workflows into usable interfaces across dense forms, tables, dashboards, and operational UI.</w:t>
-            </w:r>
-          </w:p>
-          <w:p>
-            <w:pPr>
-              <w:pStyle w:val="ListBullet"/>
-              <w:spacing w:after="24"/>
-            </w:pPr>
-            <w:r>
-              <w:rPr>
-                <w:color w:val="0F172A"/>
-              </w:rPr>
-              <w:t>Lead delivery across product, frontend, DevOps, and platform teams with production sustainment discipline.</w:t>
-            </w:r>
-          </w:p>
-          <w:p>
-            <w:pPr>
-              <w:spacing w:before="140" w:after="40"/>
-            </w:pPr>
-            <w:r>
-              <w:rPr>
-                <w:b/>
-                <w:color w:val="4F46E5"/>
-                <w:sz w:val="20"/>
-              </w:rPr>
-              <w:t>AI FRONTEND WORK</w:t>
-            </w:r>
-          </w:p>
-          <w:p>
-            <w:pPr>
-              <w:spacing w:before="80"/>
-            </w:pPr>
-            <w:r>
-              <w:rPr>
-                <w:b/>
-                <w:color w:val="0F172A"/>
-              </w:rPr>
-              <w:t>Embedded Copilot for Enterprise Apps</w:t>
-            </w:r>
-          </w:p>
-          <w:p>
-            <w:pPr>
-              <w:pStyle w:val="ListBullet"/>
-              <w:spacing w:after="24"/>
-            </w:pPr>
-            <w:r>
-              <w:rPr>
-                <w:color w:val="0F172A"/>
-              </w:rPr>
-              <w:t>Copilot concept for Angular and web apps that understands routes, selected records, forms, DOM context, and user intent.</w:t>
-            </w:r>
-          </w:p>
-          <w:p>
-            <w:pPr>
-              <w:pStyle w:val="ListBullet"/>
-              <w:spacing w:after="24"/>
-            </w:pPr>
-            <w:r>
-              <w:rPr>
-                <w:color w:val="0F172A"/>
-              </w:rPr>
-              <w:t>Multi-agent modes for plan, execute, debug, and ask workflows.</w:t>
-            </w:r>
-          </w:p>
-          <w:p>
-            <w:pPr>
-              <w:pStyle w:val="ListBullet"/>
-              <w:spacing w:after="24"/>
-            </w:pPr>
-            <w:r>
-              <w:rPr>
-                <w:color w:val="0F172A"/>
-              </w:rPr>
-              <w:t>RAG across docs, codebase knowledge, APIs, and workflows to ground responses in product context.</w:t>
-            </w:r>
-          </w:p>
-          <w:p>
-            <w:pPr>
-              <w:pStyle w:val="ListBullet"/>
-              <w:spacing w:after="24"/>
-            </w:pPr>
-            <w:r>
-              <w:rPr>
-                <w:color w:val="0F172A"/>
-              </w:rPr>
-              <w:t>Action execution through APIs, navigation, workflow tools, evaluation loops, retries, and recovery paths.</w:t>
-            </w:r>
-          </w:p>
-          <w:p>
-            <w:pPr>
-              <w:spacing w:before="80"/>
-            </w:pPr>
-            <w:r>
-              <w:rPr>
-                <w:b/>
-                <w:color w:val="0F172A"/>
-              </w:rPr>
-              <w:t>Copilot Runtime and SDK Direction</w:t>
-            </w:r>
-          </w:p>
-          <w:p>
-            <w:pPr>
-              <w:pStyle w:val="ListBullet"/>
-              <w:spacing w:after="24"/>
-            </w:pPr>
-            <w:r>
-              <w:rPr>
-                <w:color w:val="0F172A"/>
-              </w:rPr>
-              <w:t>Reusable architecture for a copilot shell, agent orchestrator, tool registry, ingestion connectors, and enterprise-safe action execution.</w:t>
-            </w:r>
-          </w:p>
-          <w:p>
-            <w:pPr>
-              <w:pStyle w:val="ListBullet"/>
-              <w:spacing w:after="24"/>
-            </w:pPr>
-            <w:r>
-              <w:rPr>
-                <w:color w:val="0F172A"/>
-              </w:rPr>
-              <w:t>Designed for teams that want AI-native behavior inside Angular and TypeScript products without one-off integrations.</w:t>
-            </w:r>
-          </w:p>
-          <w:p>
-            <w:pPr>
-              <w:spacing w:before="140" w:after="40"/>
-            </w:pPr>
-            <w:r>
-              <w:rPr>
-                <w:b/>
-                <w:color w:val="4F46E5"/>
-                <w:sz w:val="20"/>
-              </w:rPr>
-              <w:t>EMPLOYMENT HISTORY</w:t>
-            </w:r>
-          </w:p>
-          <w:p>
-            <w:pPr>
-              <w:spacing w:before="80"/>
-            </w:pPr>
-            <w:r>
-              <w:rPr>
-                <w:b/>
-                <w:color w:val="0F172A"/>
-              </w:rPr>
-              <w:t>Team Lead, Codifyd</w:t>
-            </w:r>
-            <w:r>
-              <w:rPr>
-                <w:color w:val="0F172A"/>
-              </w:rPr>
-              <w:t xml:space="preserve"> | 2018 - Present</w:t>
-            </w:r>
-          </w:p>
-          <w:p>
-            <w:pPr>
-              <w:pStyle w:val="ListBullet"/>
-              <w:spacing w:after="24"/>
-            </w:pPr>
-            <w:r>
-              <w:rPr>
-                <w:color w:val="0F172A"/>
-              </w:rPr>
-              <w:t>Own technical direction for enterprise web products, including stack fit, integration contracts, frontend architecture, and delivery trade-offs.</w:t>
-            </w:r>
-          </w:p>
-          <w:p>
-            <w:pPr>
-              <w:pStyle w:val="ListBullet"/>
-              <w:spacing w:after="24"/>
-            </w:pPr>
-            <w:r>
-              <w:rPr>
-                <w:color w:val="0F172A"/>
-              </w:rPr>
-              <w:t>Define system boundaries for large multi-module web applications and sustain production codebases through refactors, regression control, and release coordination.</w:t>
-            </w:r>
-          </w:p>
-          <w:p>
-            <w:pPr>
-              <w:pStyle w:val="ListBullet"/>
-              <w:spacing w:after="24"/>
-            </w:pPr>
-            <w:r>
-              <w:rPr>
-                <w:color w:val="0F172A"/>
-              </w:rPr>
-              <w:t>Create wireframes, interaction flows, and reusable UI patterns to align product intent with engineering constraints.</w:t>
-            </w:r>
-          </w:p>
-          <w:p>
-            <w:pPr>
-              <w:pStyle w:val="ListBullet"/>
-              <w:spacing w:after="24"/>
-            </w:pPr>
-            <w:r>
-              <w:rPr>
-                <w:color w:val="0F172A"/>
-              </w:rPr>
-              <w:t>Partner with DevOps and platform teams on CI/CD, build tooling, environment-specific defects, and cross-stack troubleshooting.</w:t>
-            </w:r>
-          </w:p>
-          <w:p>
-            <w:pPr>
-              <w:spacing w:before="80"/>
-            </w:pPr>
-            <w:r>
-              <w:rPr>
-                <w:b/>
-                <w:color w:val="0F172A"/>
-              </w:rPr>
-              <w:t>Front-end Expert, Zooty.in</w:t>
-            </w:r>
-            <w:r>
-              <w:rPr>
-                <w:color w:val="0F172A"/>
-              </w:rPr>
-              <w:t xml:space="preserve"> | 2016 - 2018</w:t>
-            </w:r>
-          </w:p>
-          <w:p>
-            <w:pPr>
-              <w:pStyle w:val="ListBullet"/>
-              <w:spacing w:after="24"/>
-            </w:pPr>
-            <w:r>
-              <w:rPr>
-                <w:color w:val="0F172A"/>
-              </w:rPr>
-              <w:t>Steered frontend implementation strategy, dependencies, sequencing, and UI architecture for customer-facing web products.</w:t>
-            </w:r>
-          </w:p>
-          <w:p>
-            <w:pPr>
-              <w:pStyle w:val="ListBullet"/>
-              <w:spacing w:after="24"/>
-            </w:pPr>
-            <w:r>
-              <w:rPr>
-                <w:color w:val="0F172A"/>
-              </w:rPr>
-              <w:t>Designed component boundaries, state ownership, interaction flows, and maintainable UI structure.</w:t>
-            </w:r>
-          </w:p>
-          <w:p>
-            <w:pPr>
-              <w:pStyle w:val="ListBullet"/>
-              <w:spacing w:after="24"/>
-            </w:pPr>
-            <w:r>
-              <w:rPr>
-                <w:color w:val="0F172A"/>
-              </w:rPr>
-              <w:t>Owned UX outcomes, defect triage, performance hotspots, and incremental hardening of live systems.</w:t>
-            </w:r>
-          </w:p>
-          <w:p>
-            <w:pPr>
-              <w:spacing w:before="80"/>
-            </w:pPr>
-            <w:r>
-              <w:rPr>
-                <w:b/>
-                <w:color w:val="0F172A"/>
-              </w:rPr>
-              <w:t>Lead Front-end Programmer, Musafir.com</w:t>
-            </w:r>
-            <w:r>
-              <w:rPr>
-                <w:color w:val="0F172A"/>
-              </w:rPr>
-              <w:t xml:space="preserve"> | 2015 - 2016</w:t>
-            </w:r>
-          </w:p>
-          <w:p>
-            <w:pPr>
-              <w:pStyle w:val="ListBullet"/>
-              <w:spacing w:after="24"/>
-            </w:pPr>
-            <w:r>
-              <w:rPr>
-                <w:color w:val="0F172A"/>
-              </w:rPr>
-              <w:t>Implemented and reviewed production UI for high-traffic travel workflows including search, pricing, booking, and checkout surfaces.</w:t>
-            </w:r>
-          </w:p>
-          <w:p>
-            <w:pPr>
-              <w:pStyle w:val="ListBullet"/>
-              <w:spacing w:after="24"/>
-            </w:pPr>
-            <w:r>
-              <w:rPr>
-                <w:color w:val="0F172A"/>
-              </w:rPr>
-              <w:t>Resolved complex rendering, layout, and performance issues under real traffic and data-load conditions.</w:t>
-            </w:r>
-          </w:p>
-          <w:p>
-            <w:pPr>
-              <w:spacing w:before="80"/>
-            </w:pPr>
-            <w:r>
-              <w:rPr>
-                <w:b/>
-                <w:color w:val="0F172A"/>
-              </w:rPr>
-              <w:t>Senior Front-end Developer, Verdantis Pvt Ltd.</w:t>
-            </w:r>
-            <w:r>
-              <w:rPr>
-                <w:color w:val="0F172A"/>
-              </w:rPr>
-              <w:t xml:space="preserve"> | 2014 - 2015</w:t>
-            </w:r>
-          </w:p>
-          <w:p>
-            <w:pPr>
-              <w:pStyle w:val="ListBullet"/>
-              <w:spacing w:after="24"/>
-            </w:pPr>
-            <w:r>
-              <w:rPr>
-                <w:color w:val="0F172A"/>
-              </w:rPr>
-              <w:t>Built data-dense enterprise interfaces with strict validation, forms, tables, and workflow requirements.</w:t>
-            </w:r>
-          </w:p>
-          <w:p>
-            <w:pPr>
-              <w:pStyle w:val="ListBullet"/>
-              <w:spacing w:after="24"/>
-            </w:pPr>
-            <w:r>
-              <w:rPr>
-                <w:color w:val="0F172A"/>
-              </w:rPr>
-              <w:t>Supported Scrum delivery, browser regression fixes, API/schema-linked UI defects, UAT cycles, and production RCA.</w:t>
-            </w:r>
-          </w:p>
-          <w:p>
-            <w:pPr>
-              <w:spacing w:before="80"/>
-            </w:pPr>
-            <w:r>
-              <w:rPr>
-                <w:b/>
-                <w:color w:val="0F172A"/>
-              </w:rPr>
-              <w:t>Frontend / Web Consultant, Capgemini, Efurtherance, E10 InfoTech, Aambit Softwares</w:t>
-            </w:r>
-            <w:r>
-              <w:rPr>
-                <w:color w:val="0F172A"/>
-              </w:rPr>
-              <w:t xml:space="preserve"> | 2012 - 2014</w:t>
-            </w:r>
-          </w:p>
-          <w:p>
-            <w:pPr>
-              <w:pStyle w:val="ListBullet"/>
-              <w:spacing w:after="24"/>
-            </w:pPr>
-            <w:r>
-              <w:rPr>
-                <w:color w:val="0F172A"/>
-              </w:rPr>
-              <w:t>Delivered frontend modules, layouts, mockups, client checkpoints, bug fixes, and integration support across early client projects.</w:t>
-            </w:r>
-          </w:p>
-        </w:tc>
-      </w:tr>
-    </w:tbl>
     <w:p>
       <w:pPr>
-        <w:sectPr>
-          <w:pgSz w:w="12240" w:h="15840"/>
-          <w:pgMar w:top="403" w:right="403" w:bottom="403" w:left="403" w:header="720" w:footer="720" w:gutter="0"/>
-          <w:cols w:space="720"/>
-          <w:docGrid w:linePitch="360"/>
-        </w:sectPr>
-      </w:pPr>
-    </w:p>
-    <w:p>
-      <w:pPr>
-        <w:spacing w:before="140" w:after="40"/>
+        <w:spacing w:after="0"/>
       </w:pPr>
       <w:r>
         <w:rPr>
           <w:b/>
-          <w:color w:val="4F46E5"/>
-          <w:sz w:val="20"/>
+          <w:color w:val="1F3A8A"/>
+          <w:sz w:val="40"/>
         </w:rPr>
-        <w:t>TECHNICAL CAPABILITIES</w:t>
+        <w:t>Ankit Parekh</w:t>
       </w:r>
     </w:p>
-    <w:tbl>
-      <w:tblPr>
-        <w:tblStyle w:val="TableGrid"/>
-        <w:tblW w:type="auto" w:w="0"/>
-        <w:tblLayout w:type="fixed"/>
-        <w:tblLook w:firstColumn="1" w:firstRow="1" w:lastColumn="0" w:lastRow="0" w:noHBand="0" w:noVBand="1" w:val="04A0"/>
-      </w:tblPr>
-      <w:tblGrid>
-        <w:gridCol w:w="5328"/>
-        <w:gridCol w:w="5328"/>
-      </w:tblGrid>
-      <w:tr>
-        <w:tc>
-          <w:tcPr>
-            <w:tcW w:type="dxa" w:w="1700"/>
-            <w:shd w:fill="EEF2FF"/>
-          </w:tcPr>
-          <w:p>
-            <w:pPr>
-              <w:spacing w:after="0"/>
-            </w:pPr>
-            <w:r>
-              <w:rPr>
-                <w:b/>
-                <w:sz w:val="16"/>
-              </w:rPr>
-              <w:t>Frontend</w:t>
-            </w:r>
-          </w:p>
-        </w:tc>
-        <w:tc>
-          <w:tcPr>
-            <w:tcW w:type="dxa" w:w="6500"/>
-          </w:tcPr>
-          <w:p>
-            <w:pPr>
-              <w:spacing w:after="0"/>
-            </w:pPr>
-            <w:r>
-              <w:rPr>
-                <w:sz w:val="16"/>
-              </w:rPr>
-              <w:t>Angular, TypeScript, RxJS, JavaScript, HTML5, CSS3, Sass, React</w:t>
-            </w:r>
-          </w:p>
-        </w:tc>
-      </w:tr>
-      <w:tr>
-        <w:tc>
-          <w:tcPr>
-            <w:tcW w:type="dxa" w:w="1700"/>
-            <w:shd w:fill="EEF2FF"/>
-          </w:tcPr>
-          <w:p>
-            <w:pPr>
-              <w:spacing w:after="0"/>
-            </w:pPr>
-            <w:r>
-              <w:rPr>
-                <w:b/>
-                <w:sz w:val="16"/>
-              </w:rPr>
-              <w:t>AI / LLM</w:t>
-            </w:r>
-          </w:p>
-        </w:tc>
-        <w:tc>
-          <w:tcPr>
-            <w:tcW w:type="dxa" w:w="6500"/>
-          </w:tcPr>
-          <w:p>
-            <w:pPr>
-              <w:spacing w:after="0"/>
-            </w:pPr>
-            <w:r>
-              <w:rPr>
-                <w:sz w:val="16"/>
-              </w:rPr>
-              <w:t>Copilots, RAG, AI agents, tool calling, streaming UX, prompt flows, guardrails</w:t>
-            </w:r>
-          </w:p>
-        </w:tc>
-      </w:tr>
-      <w:tr>
-        <w:tc>
-          <w:tcPr>
-            <w:tcW w:type="dxa" w:w="1700"/>
-            <w:shd w:fill="EEF2FF"/>
-          </w:tcPr>
-          <w:p>
-            <w:pPr>
-              <w:spacing w:after="0"/>
-            </w:pPr>
-            <w:r>
-              <w:rPr>
-                <w:b/>
-                <w:sz w:val="16"/>
-              </w:rPr>
-              <w:t>Architecture</w:t>
-            </w:r>
-          </w:p>
-        </w:tc>
-        <w:tc>
-          <w:tcPr>
-            <w:tcW w:type="dxa" w:w="6500"/>
-          </w:tcPr>
-          <w:p>
-            <w:pPr>
-              <w:spacing w:after="0"/>
-            </w:pPr>
-            <w:r>
-              <w:rPr>
-                <w:sz w:val="16"/>
-              </w:rPr>
-              <w:t>Enterprise UI platforms, modular systems, design systems, state ownership</w:t>
-            </w:r>
-          </w:p>
-        </w:tc>
-      </w:tr>
-      <w:tr>
-        <w:tc>
-          <w:tcPr>
-            <w:tcW w:type="dxa" w:w="1700"/>
-            <w:shd w:fill="EEF2FF"/>
-          </w:tcPr>
-          <w:p>
-            <w:pPr>
-              <w:spacing w:after="0"/>
-            </w:pPr>
-            <w:r>
-              <w:rPr>
-                <w:b/>
-                <w:sz w:val="16"/>
-              </w:rPr>
-              <w:t>Cloud</w:t>
-            </w:r>
-          </w:p>
-        </w:tc>
-        <w:tc>
-          <w:tcPr>
-            <w:tcW w:type="dxa" w:w="6500"/>
-          </w:tcPr>
-          <w:p>
-            <w:pPr>
-              <w:spacing w:after="0"/>
-            </w:pPr>
-            <w:r>
-              <w:rPr>
-                <w:sz w:val="16"/>
-              </w:rPr>
-              <w:t>AWS, Docker, Kubernetes, Jenkins, CI/CD</w:t>
-            </w:r>
-          </w:p>
-        </w:tc>
-      </w:tr>
-      <w:tr>
-        <w:tc>
-          <w:tcPr>
-            <w:tcW w:type="dxa" w:w="1700"/>
-            <w:shd w:fill="EEF2FF"/>
-          </w:tcPr>
-          <w:p>
-            <w:pPr>
-              <w:spacing w:after="0"/>
-            </w:pPr>
-            <w:r>
-              <w:rPr>
-                <w:b/>
-                <w:sz w:val="16"/>
-              </w:rPr>
-              <w:t>Backend</w:t>
-            </w:r>
-          </w:p>
-        </w:tc>
-        <w:tc>
-          <w:tcPr>
-            <w:tcW w:type="dxa" w:w="6500"/>
-          </w:tcPr>
-          <w:p>
-            <w:pPr>
-              <w:spacing w:after="0"/>
-            </w:pPr>
-            <w:r>
-              <w:rPr>
-                <w:sz w:val="16"/>
-              </w:rPr>
-              <w:t>Node.js, Express.js, Python</w:t>
-            </w:r>
-          </w:p>
-        </w:tc>
-      </w:tr>
-    </w:tbl>
+    <w:p>
+      <w:r>
+        <w:rPr>
+          <w:b/>
+        </w:rPr>
+        <w:t>Principal Frontend &amp; AI Agent Architect | Angular &amp; TypeScript | Enterprise Copilots, RAG &amp; Agentic Workflows | 18+ Years</w:t>
+      </w:r>
+    </w:p>
+    <w:p>
+      <w:r>
+        <w:t>Mumbai, India · Open to relocation (Germany, Ireland, UAE) or remote · Immediate start</w:t>
+      </w:r>
+    </w:p>
+    <w:p>
+      <w:r>
+        <w:t xml:space="preserve">ankit77parekh@gmail.com · +91 99203 53532 · </w:t>
+      </w:r>
+      <w:hyperlink r:id="rId9">
+        <w:r>
+          <w:rPr>
+            <w:color w:val="1F3A8A"/>
+          </w:rPr>
+          <w:t xml:space="preserve">linkedin.com/in/akkiparekh</w:t>
+        </w:r>
+      </w:hyperlink>
+      <w:r>
+        <w:t xml:space="preserve"> · </w:t>
+      </w:r>
+      <w:hyperlink r:id="rId10">
+        <w:r>
+          <w:rPr>
+            <w:color w:val="1F3A8A"/>
+          </w:rPr>
+          <w:t xml:space="preserve">github.com/AnkitParekh007</w:t>
+        </w:r>
+      </w:hyperlink>
+      <w:r>
+        <w:t xml:space="preserve"> · </w:t>
+      </w:r>
+      <w:hyperlink r:id="rId11">
+        <w:r>
+          <w:rPr>
+            <w:color w:val="1F3A8A"/>
+          </w:rPr>
+          <w:t xml:space="preserve">Portfolio</w:t>
+        </w:r>
+      </w:hyperlink>
+    </w:p>
     <w:p>
       <w:pPr>
-        <w:spacing w:before="140" w:after="40"/>
+        <w:spacing w:before="160" w:after="60"/>
+        <w:pBdr>
+          <w:bottom w:val="single" w:sz="6" w:space="1" w:color="1F3A8A"/>
+        </w:pBdr>
       </w:pPr>
       <w:r>
         <w:rPr>
           <w:b/>
-          <w:color w:val="4F46E5"/>
-          <w:sz w:val="20"/>
+          <w:color w:val="1F3A8A"/>
+          <w:sz w:val="22"/>
         </w:rPr>
-        <w:t>PRODUCTION DOMAINS</w:t>
+        <w:t>SUMMARY</w:t>
+      </w:r>
+    </w:p>
+    <w:p>
+      <w:r>
+        <w:t xml:space="preserve">Frontend architect with 18+ years building enterprise web products, including a year on-site in Berlin. Most recently architected and led </w:t>
+      </w:r>
+      <w:r>
+        <w:rPr>
+          <w:b/>
+        </w:rPr>
+        <w:t>SOP Co-Pilot</w:t>
+      </w:r>
+      <w:r>
+        <w:t>, an in-app AI agent for a product-content SaaS platform (20+ enterprise customers, ~10M SKUs). It plans multi-step UI actions, gets user approval before any data change, and records every run. Led a team of 7 and owned frontend architecture across multiple Angular products. Strongest where AI agents must act safely inside real enterprise workflows.</w:t>
+      </w:r>
+    </w:p>
+    <w:p>
+      <w:pPr>
+        <w:spacing w:before="160" w:after="60"/>
+        <w:pBdr>
+          <w:bottom w:val="single" w:sz="6" w:space="1" w:color="1F3A8A"/>
+        </w:pBdr>
+      </w:pPr>
+      <w:r>
+        <w:rPr>
+          <w:b/>
+          <w:color w:val="1F3A8A"/>
+          <w:sz w:val="22"/>
+        </w:rPr>
+        <w:t>CORE SKILLS</w:t>
       </w:r>
     </w:p>
     <w:p>
       <w:pPr>
         <w:pStyle w:val="ListBullet"/>
-        <w:spacing w:after="24"/>
+        <w:spacing w:after="20"/>
       </w:pPr>
       <w:r>
-        <w:t>Travel tech: search, pricing, booking, checkout, high-traffic consumer flows.</w:t>
+        <w:rPr>
+          <w:b/>
+        </w:rPr>
+        <w:t>AI / agents:</w:t>
+      </w:r>
+      <w:r>
+        <w:t xml:space="preserve"> agent planning and tool execution, approval and risk gating, RAG with hybrid retrieval and embeddings, multi-provider LLM routing (OpenAI, Anthropic), streaming UX (SSE), eval harnesses, guardrails, MCP</w:t>
       </w:r>
     </w:p>
     <w:p>
       <w:pPr>
         <w:pStyle w:val="ListBullet"/>
-        <w:spacing w:after="24"/>
+        <w:spacing w:after="20"/>
       </w:pPr>
       <w:r>
-        <w:t>Product data platforms: catalogs, governance workflows, bulk actions, and analyst operations.</w:t>
+        <w:rPr>
+          <w:b/>
+        </w:rPr>
+        <w:t>Frontend:</w:t>
+      </w:r>
+      <w:r>
+        <w:t xml:space="preserve"> Angular (12 to 21), TypeScript, RxJS, Angular Material, AG Grid Enterprise, Handsontable, service workers, i18n, React</w:t>
       </w:r>
     </w:p>
     <w:p>
       <w:pPr>
         <w:pStyle w:val="ListBullet"/>
-        <w:spacing w:after="24"/>
+        <w:spacing w:after="20"/>
       </w:pPr>
       <w:r>
-        <w:t>Logistics systems: dashboards, shipment visibility, exceptions, and role-based workflows.</w:t>
+        <w:rPr>
+          <w:b/>
+        </w:rPr>
+        <w:t>Backend &amp; data:</w:t>
+      </w:r>
+      <w:r>
+        <w:t xml:space="preserve"> NestJS, Node.js, Express, Java, Python, PySpark</w:t>
       </w:r>
     </w:p>
     <w:p>
       <w:pPr>
-        <w:spacing w:before="140" w:after="40"/>
+        <w:pStyle w:val="ListBullet"/>
+        <w:spacing w:after="20"/>
       </w:pPr>
       <w:r>
         <w:rPr>
           <w:b/>
-          <w:color w:val="4F46E5"/>
-          <w:sz w:val="20"/>
+        </w:rPr>
+        <w:t>Delivery:</w:t>
+      </w:r>
+      <w:r>
+        <w:t xml:space="preserve"> AWS, Docker, Kubernetes, Jenkins, Bitbucket Pipelines, multi-environment CDN releases</w:t>
+      </w:r>
+    </w:p>
+    <w:p>
+      <w:pPr>
+        <w:pStyle w:val="ListBullet"/>
+        <w:spacing w:after="20"/>
+      </w:pPr>
+      <w:r>
+        <w:rPr>
+          <w:b/>
+        </w:rPr>
+        <w:t>Leadership:</w:t>
+      </w:r>
+      <w:r>
+        <w:t xml:space="preserve"> team of 7, architecture ownership across products, API design, code review, mentoring</w:t>
+      </w:r>
+    </w:p>
+    <w:p>
+      <w:pPr>
+        <w:spacing w:before="160" w:after="60"/>
+        <w:pBdr>
+          <w:bottom w:val="single" w:sz="6" w:space="1" w:color="1F3A8A"/>
+        </w:pBdr>
+      </w:pPr>
+      <w:r>
+        <w:rPr>
+          <w:b/>
+          <w:color w:val="1F3A8A"/>
+          <w:sz w:val="22"/>
+        </w:rPr>
+        <w:t>EXPERIENCE</w:t>
+      </w:r>
+    </w:p>
+    <w:p>
+      <w:pPr>
+        <w:keepNext/>
+        <w:spacing w:before="100"/>
+      </w:pPr>
+      <w:r>
+        <w:rPr>
+          <w:b/>
+          <w:sz w:val="21"/>
+        </w:rPr>
+        <w:t>Frontend Architect (Contract), Bluemeteor (formerly Codifyd), remote for US company · Sep 2022 to Oct 2026</w:t>
+      </w:r>
+    </w:p>
+    <w:p>
+      <w:r>
+        <w:t>AI-powered product information and content platform (PIM/PXM/DAM) for manufacturers, distributors and retailers.</w:t>
+      </w:r>
+    </w:p>
+    <w:p>
+      <w:pPr>
+        <w:pStyle w:val="ListBullet"/>
+        <w:spacing w:after="20"/>
+      </w:pPr>
+      <w:r>
+        <w:t xml:space="preserve">Architected and led </w:t>
+      </w:r>
+      <w:r>
+        <w:rPr>
+          <w:b/>
+        </w:rPr>
+        <w:t>SOP Co-Pilot</w:t>
+      </w:r>
+      <w:r>
+        <w:t xml:space="preserve"> end to end (Angular client and NestJS service). It answers questions from on-screen context and docs with citations, and plans multi-step actions that run only after the user approves.</w:t>
+      </w:r>
+    </w:p>
+    <w:p>
+      <w:pPr>
+        <w:pStyle w:val="ListBullet"/>
+        <w:spacing w:after="20"/>
+      </w:pPr>
+      <w:r>
+        <w:t xml:space="preserve">Designed a </w:t>
+      </w:r>
+      <w:r>
+        <w:rPr>
+          <w:b/>
+        </w:rPr>
+        <w:t>plan-first agent architecture</w:t>
+      </w:r>
+      <w:r>
+        <w:t>: a deterministic action catalog generated from the app, risk classes that separate reads from data changes, plan-once approval, re-plan on failure, and an audit ledger. Chosen over free-form tool calling so agents cannot invent steps on enterprise write paths.</w:t>
+      </w:r>
+    </w:p>
+    <w:p>
+      <w:pPr>
+        <w:pStyle w:val="ListBullet"/>
+        <w:spacing w:after="20"/>
+      </w:pPr>
+      <w:r>
+        <w:t>Built the service layer: JWT authorization, rate limits, SSE streaming, policy enforcement, a provider-routed LLM layer with tenant bring-your-own-key, hybrid retrieval, cost metrics and prompt sanitization.</w:t>
+      </w:r>
+    </w:p>
+    <w:p>
+      <w:pPr>
+        <w:pStyle w:val="ListBullet"/>
+        <w:spacing w:after="20"/>
+      </w:pPr>
+      <w:r>
+        <w:t xml:space="preserve">Created the </w:t>
+      </w:r>
+      <w:r>
+        <w:rPr>
+          <w:b/>
+        </w:rPr>
+        <w:t>agent evaluation harness</w:t>
+      </w:r>
+      <w:r>
+        <w:t xml:space="preserve"> (golden goals, gate pass/fail reports) and security/regression specs that gate releases. Shipped as an enterprise pilot with feature-flag gates in every environment.</w:t>
+      </w:r>
+    </w:p>
+    <w:p>
+      <w:pPr>
+        <w:pStyle w:val="ListBullet"/>
+        <w:spacing w:after="20"/>
+      </w:pPr>
+      <w:r>
+        <w:t xml:space="preserve">Led the </w:t>
+      </w:r>
+      <w:r>
+        <w:rPr>
+          <w:b/>
+        </w:rPr>
+        <w:t>AI-assisted mapping and finalize-mapping</w:t>
+      </w:r>
+      <w:r>
+        <w:t xml:space="preserve"> experience shared by the supplier and retailer apps. It replaced field-by-field manual mapping with AI suggestions, human review and confidence-based bulk accept.</w:t>
+      </w:r>
+    </w:p>
+    <w:p>
+      <w:pPr>
+        <w:pStyle w:val="ListBullet"/>
+        <w:spacing w:after="20"/>
+      </w:pPr>
+      <w:r>
+        <w:t xml:space="preserve">Removed a </w:t>
+      </w:r>
+      <w:r>
+        <w:rPr>
+          <w:b/>
+        </w:rPr>
+        <w:t>multi-minute UI freeze</w:t>
+      </w:r>
+      <w:r>
+        <w:t>: screen-context reads were making ~551 lookup calls for a region showing at most 40 rows, and scoping reads to the visible region fixed it.</w:t>
+      </w:r>
+    </w:p>
+    <w:p>
+      <w:pPr>
+        <w:pStyle w:val="ListBullet"/>
+        <w:spacing w:after="20"/>
+      </w:pPr>
+      <w:r>
+        <w:t>Owned AG Grid Enterprise screens for submissions, submission details and digital assets, plus the release pipelines from playground to production with CDN deploys and automated release notes.</w:t>
+      </w:r>
+    </w:p>
+    <w:p>
+      <w:pPr>
+        <w:keepNext/>
+        <w:spacing w:before="100"/>
+      </w:pPr>
+      <w:r>
+        <w:rPr>
+          <w:b/>
+          <w:sz w:val="21"/>
+        </w:rPr>
+        <w:t>Senior Frontend Engineer, Forto GmbH, Berlin, Germany · Sep 2021 to Sep 2022</w:t>
+      </w:r>
+    </w:p>
+    <w:p>
+      <w:r>
+        <w:t>Digital freight forwarding / logistics platform.</w:t>
+      </w:r>
+    </w:p>
+    <w:p>
+      <w:pPr>
+        <w:pStyle w:val="ListBullet"/>
+        <w:spacing w:after="20"/>
+      </w:pPr>
+      <w:r>
+        <w:t>Relocated to Berlin to join the frontend team of a digital freight-forwarding platform.</w:t>
+      </w:r>
+    </w:p>
+    <w:p>
+      <w:pPr>
+        <w:pStyle w:val="ListBullet"/>
+        <w:spacing w:after="20"/>
+      </w:pPr>
+      <w:r>
+        <w:t>Built frontend features for logistics dashboards, shipment visibility, exception handling and role-based workflows.</w:t>
+      </w:r>
+    </w:p>
+    <w:p>
+      <w:pPr>
+        <w:keepNext/>
+        <w:spacing w:before="100"/>
+      </w:pPr>
+      <w:r>
+        <w:rPr>
+          <w:b/>
+          <w:sz w:val="21"/>
+        </w:rPr>
+        <w:t>Team Lead, Codifyd · 2018 to 2021</w:t>
+      </w:r>
+    </w:p>
+    <w:p>
+      <w:pPr>
+        <w:pStyle w:val="ListBullet"/>
+        <w:spacing w:after="20"/>
+      </w:pPr>
+      <w:r>
+        <w:t>Led a team of 7 developers and owned frontend architecture across multiple enterprise products: Amaze UI (retailer PIM), Supplier Portal and BridgeWeb.</w:t>
+      </w:r>
+    </w:p>
+    <w:p>
+      <w:pPr>
+        <w:pStyle w:val="ListBullet"/>
+        <w:spacing w:after="20"/>
+      </w:pPr>
+      <w:r>
+        <w:t>Set technical direction (stack choice, integration contracts, delivery trade-offs) and defined module boundaries for large multi-module Angular applications.</w:t>
+      </w:r>
+    </w:p>
+    <w:p>
+      <w:pPr>
+        <w:pStyle w:val="ListBullet"/>
+        <w:spacing w:after="20"/>
+      </w:pPr>
+      <w:r>
+        <w:t>Sustained production codebases through refactors, regression control and release coordination; partnered with DevOps on CI/CD.</w:t>
+      </w:r>
+    </w:p>
+    <w:p>
+      <w:pPr>
+        <w:keepNext/>
+        <w:spacing w:before="100"/>
+      </w:pPr>
+      <w:r>
+        <w:rPr>
+          <w:b/>
+          <w:sz w:val="21"/>
+        </w:rPr>
+        <w:t>Earlier experience · 2012 to 2018</w:t>
+      </w:r>
+    </w:p>
+    <w:p>
+      <w:pPr>
+        <w:pStyle w:val="ListBullet"/>
+        <w:spacing w:after="20"/>
+      </w:pPr>
+      <w:r>
+        <w:rPr>
+          <w:b/>
+        </w:rPr>
+        <w:t>Front-end Expert, Zooty.in</w:t>
+      </w:r>
+      <w:r>
+        <w:t xml:space="preserve"> (2016 to 2018): UI architecture, component boundaries and state ownership for customer-facing products; performance and hardening of live systems.</w:t>
+      </w:r>
+    </w:p>
+    <w:p>
+      <w:pPr>
+        <w:pStyle w:val="ListBullet"/>
+        <w:spacing w:after="20"/>
+      </w:pPr>
+      <w:r>
+        <w:rPr>
+          <w:b/>
+        </w:rPr>
+        <w:t>Lead Front-end Programmer, Musafir.com</w:t>
+      </w:r>
+      <w:r>
+        <w:t xml:space="preserve"> (2015 to 2016): high-traffic travel search, pricing, booking and checkout UI; performance under real traffic.</w:t>
+      </w:r>
+    </w:p>
+    <w:p>
+      <w:pPr>
+        <w:pStyle w:val="ListBullet"/>
+        <w:spacing w:after="20"/>
+      </w:pPr>
+      <w:r>
+        <w:rPr>
+          <w:b/>
+        </w:rPr>
+        <w:t>Senior Front-end Developer, Verdantis</w:t>
+      </w:r>
+      <w:r>
+        <w:t xml:space="preserve"> (2014 to 2015): data-dense enterprise UIs with strict validation.</w:t>
+      </w:r>
+    </w:p>
+    <w:p>
+      <w:pPr>
+        <w:pStyle w:val="ListBullet"/>
+        <w:spacing w:after="20"/>
+      </w:pPr>
+      <w:r>
+        <w:t>Capgemini (freelance), Efurtherance, E10 InfoTech, Aambit Softwares (2012 to 2014).</w:t>
+      </w:r>
+    </w:p>
+    <w:p>
+      <w:pPr>
+        <w:spacing w:before="160" w:after="60"/>
+        <w:pBdr>
+          <w:bottom w:val="single" w:sz="6" w:space="1" w:color="1F3A8A"/>
+        </w:pBdr>
+      </w:pPr>
+      <w:r>
+        <w:rPr>
+          <w:b/>
+          <w:color w:val="1F3A8A"/>
+          <w:sz w:val="22"/>
+        </w:rPr>
+        <w:t>OPEN-SOURCE &amp; PUBLIC WORK</w:t>
+      </w:r>
+    </w:p>
+    <w:p>
+      <w:pPr>
+        <w:pStyle w:val="ListBullet"/>
+        <w:spacing w:after="20"/>
+      </w:pPr>
+      <w:r>
+        <w:rPr>
+          <w:b/>
+        </w:rPr>
+        <w:t>ngx-copilot-platform:</w:t>
+      </w:r>
+      <w:r>
+        <w:t xml:space="preserve"> Angular copilot SDK with a Next.js RAG backend on Supabase pgvector</w:t>
+      </w:r>
+    </w:p>
+    <w:p>
+      <w:pPr>
+        <w:pStyle w:val="ListBullet"/>
+        <w:spacing w:after="20"/>
+      </w:pPr>
+      <w:r>
+        <w:rPr>
+          <w:b/>
+        </w:rPr>
+        <w:t>org-ai-force:</w:t>
+      </w:r>
+      <w:r>
+        <w:t xml:space="preserve"> Angular 21 AI agent workspace with a NestJS orchestrator, RAG and MCP tools</w:t>
+      </w:r>
+    </w:p>
+    <w:p>
+      <w:pPr>
+        <w:pStyle w:val="ListBullet"/>
+        <w:spacing w:after="20"/>
+      </w:pPr>
+      <w:r>
+        <w:rPr>
+          <w:b/>
+        </w:rPr>
+        <w:t>agent-studio:</w:t>
+      </w:r>
+      <w:r>
+        <w:t xml:space="preserve"> visual builder for AI agents with MCP tools and provider abstraction</w:t>
+      </w:r>
+    </w:p>
+    <w:p>
+      <w:pPr>
+        <w:pStyle w:val="ListBullet"/>
+        <w:spacing w:after="20"/>
+      </w:pPr>
+      <w:r>
+        <w:rPr>
+          <w:b/>
+        </w:rPr>
+        <w:t>Agentic-Engineering-Playbook:</w:t>
+      </w:r>
+      <w:r>
+        <w:t xml:space="preserve"> open roadmap for production-grade agents, RAG and MCP tools</w:t>
+      </w:r>
+    </w:p>
+    <w:p>
+      <w:pPr>
+        <w:spacing w:before="160" w:after="60"/>
+        <w:pBdr>
+          <w:bottom w:val="single" w:sz="6" w:space="1" w:color="1F3A8A"/>
+        </w:pBdr>
+      </w:pPr>
+      <w:r>
+        <w:rPr>
+          <w:b/>
+          <w:color w:val="1F3A8A"/>
+          <w:sz w:val="22"/>
         </w:rPr>
         <w:t>EDUCATION</w:t>
       </w:r>
     </w:p>
     <w:p>
-      <w:pPr>
-        <w:pStyle w:val="ListBullet"/>
-        <w:spacing w:after="24"/>
-      </w:pPr>
       <w:r>
-        <w:t>Bachelor of Engineering in Computer Science - Atharva College of Engineering, Mumbai</w:t>
-      </w:r>
-    </w:p>
-    <w:p>
-      <w:pPr>
-        <w:pStyle w:val="ListBullet"/>
-        <w:spacing w:after="24"/>
-      </w:pPr>
-      <w:r>
-        <w:t>Higher Secondary Education - Royal College of Arts &amp; Science, Mumbai</w:t>
-      </w:r>
-    </w:p>
-    <w:p>
-      <w:pPr>
-        <w:spacing w:before="140" w:after="40"/>
-      </w:pPr>
-      <w:r>
-        <w:rPr>
-          <w:b/>
-          <w:color w:val="4F46E5"/>
-          <w:sz w:val="20"/>
-        </w:rPr>
-        <w:t>PUBLIC PROOF</w:t>
-      </w:r>
-    </w:p>
-    <w:p>
-      <w:pPr>
-        <w:pStyle w:val="ListBullet"/>
-        <w:spacing w:after="24"/>
-      </w:pPr>
-      <w:r>
-        <w:t>GitHub: github.com/AnkitParekh007</w:t>
-      </w:r>
-    </w:p>
-    <w:p>
-      <w:pPr>
-        <w:pStyle w:val="ListBullet"/>
-        <w:spacing w:after="24"/>
-      </w:pPr>
-      <w:r>
-        <w:t>Portfolio: ankitparekh007.github.io/resume/</w:t>
-      </w:r>
-    </w:p>
-    <w:p>
-      <w:pPr>
-        <w:pStyle w:val="ListBullet"/>
-        <w:spacing w:after="24"/>
-      </w:pPr>
-      <w:r>
-        <w:t>Current direction: angular-ai-copilot-starter, ngx-copilot-sdk, ai-ui-agent-demo, frontend-ai-patterns.</w:t>
+        <w:t>B.E. Computer Science, Atharva College of Engineering, Mumbai, 2013</w:t>
       </w:r>
     </w:p>
     <w:sectPr>
-      <w:pgSz w:w="12240" w:h="15840"/>
-      <w:pgMar w:top="648" w:right="792" w:bottom="648" w:left="792" w:header="720" w:footer="720" w:gutter="0"/>
+      <w:pgSz w:w="11909" w:h="16834"/>
+      <w:pgMar w:top="864" w:right="1008" w:bottom="864" w:left="1008" w:header="720" w:footer="720" w:gutter="0"/>
       <w:cols w:space="720"/>
       <w:docGrid w:linePitch="360"/>
     </w:sectPr>
@@ -1485,9 +939,12 @@
     <w:name w:val="Normal"/>
     <w:qFormat/>
     <w:rsid w:val="00FC693F"/>
+    <w:pPr>
+      <w:spacing w:after="40"/>
+    </w:pPr>
     <w:rPr>
-      <w:rFonts w:ascii="Aptos" w:hAnsi="Aptos"/>
-      <w:sz w:val="17"/>
+      <w:rFonts w:ascii="Calibri" w:hAnsi="Calibri"/>
+      <w:sz w:val="21"/>
     </w:rPr>
   </w:style>
   <w:style w:type="paragraph" w:styleId="Header">

</xml_diff>

<commit_message>
Refresh downloadable resume: one-page redesign
Co-Authored-By: Claude Opus 5.5 <noreply@anthropic.com>
</commit_message>
<xml_diff>
--- a/AnkitParekh_Resume.docx
+++ b/AnkitParekh_Resume.docx
@@ -20,12 +20,12 @@
         <w:rPr>
           <w:b/>
         </w:rPr>
-        <w:t>Principal Frontend &amp; AI Agent Architect | Angular &amp; TypeScript | Enterprise Copilots, RAG &amp; Agentic Workflows | 18+ Years</w:t>
+        <w:t>Principal Frontend &amp; AI Agent Architect · Angular, TypeScript, Enterprise Copilots</w:t>
       </w:r>
     </w:p>
     <w:p>
       <w:r>
-        <w:t>Mumbai, India · Open to relocation (Germany, Ireland, UAE) or remote · Immediate start</w:t>
+        <w:t>Mumbai, India · Open to relocation (Germany, Ireland, UAE) or remote · Former EU Blue Card holder (Berlin 2021–22) · Available now</w:t>
       </w:r>
     </w:p>
     <w:p>
@@ -76,12 +76,12 @@
           <w:color w:val="1F3A8A"/>
           <w:sz w:val="22"/>
         </w:rPr>
-        <w:t>SUMMARY</w:t>
+        <w:t>PROFILE</w:t>
       </w:r>
     </w:p>
     <w:p>
       <w:r>
-        <w:t xml:space="preserve">Frontend architect with 18+ years building enterprise web products, including a year on-site in Berlin. Most recently architected and led </w:t>
+        <w:t xml:space="preserve">Frontend architect with 18+ years building enterprise web products and 7+ years leading architecture across multiple SaaS products. Most recently I architected </w:t>
       </w:r>
       <w:r>
         <w:rPr>
@@ -90,7 +90,7 @@
         <w:t>SOP Co-Pilot</w:t>
       </w:r>
       <w:r>
-        <w:t>, an in-app AI agent for a product-content SaaS platform (20+ enterprise customers, ~10M SKUs). It plans multi-step UI actions, gets user approval before any data change, and records every run. Led a team of 7 and owned frontend architecture across multiple Angular products. Strongest where AI agents must act safely inside real enterprise workflows.</w:t>
+        <w:t>, an in-app AI agent for a product-content platform with 20+ enterprise customers and ~10M SKUs. It works plan-first and approval-gated, and every run is audited and checked by evals.</w:t>
       </w:r>
     </w:p>
     <w:p>
@@ -106,22 +106,7 @@
           <w:color w:val="1F3A8A"/>
           <w:sz w:val="22"/>
         </w:rPr>
-        <w:t>CORE SKILLS</w:t>
-      </w:r>
-    </w:p>
-    <w:p>
-      <w:pPr>
-        <w:pStyle w:val="ListBullet"/>
-        <w:spacing w:after="20"/>
-      </w:pPr>
-      <w:r>
-        <w:rPr>
-          <w:b/>
-        </w:rPr>
-        <w:t>AI / agents:</w:t>
-      </w:r>
-      <w:r>
-        <w:t xml:space="preserve"> agent planning and tool execution, approval and risk gating, RAG with hybrid retrieval and embeddings, multi-provider LLM routing (OpenAI, Anthropic), streaming UX (SSE), eval harnesses, guardrails, MCP</w:t>
+        <w:t>SKILLS</w:t>
       </w:r>
     </w:p>
     <w:p>
@@ -136,7 +121,7 @@
         <w:t>Frontend:</w:t>
       </w:r>
       <w:r>
-        <w:t xml:space="preserve"> Angular (12 to 21), TypeScript, RxJS, Angular Material, AG Grid Enterprise, Handsontable, service workers, i18n, React</w:t>
+        <w:t xml:space="preserve"> Angular (12 to 21), TypeScript, RxJS, Angular Material, AG Grid Enterprise, service workers, i18n, React</w:t>
       </w:r>
     </w:p>
     <w:p>
@@ -148,10 +133,10 @@
         <w:rPr>
           <w:b/>
         </w:rPr>
-        <w:t>Backend &amp; data:</w:t>
+        <w:t>AI &amp; agents:</w:t>
       </w:r>
       <w:r>
-        <w:t xml:space="preserve"> NestJS, Node.js, Express, Java, Python, PySpark</w:t>
+        <w:t xml:space="preserve"> planners, tool and policy enforcement, approval gating, RAG, evals, streaming UX, LLM routing (OpenAI, Anthropic), MCP</w:t>
       </w:r>
     </w:p>
     <w:p>
@@ -163,25 +148,10 @@
         <w:rPr>
           <w:b/>
         </w:rPr>
-        <w:t>Delivery:</w:t>
+        <w:t>Platform:</w:t>
       </w:r>
       <w:r>
-        <w:t xml:space="preserve"> AWS, Docker, Kubernetes, Jenkins, Bitbucket Pipelines, multi-environment CDN releases</w:t>
-      </w:r>
-    </w:p>
-    <w:p>
-      <w:pPr>
-        <w:pStyle w:val="ListBullet"/>
-        <w:spacing w:after="20"/>
-      </w:pPr>
-      <w:r>
-        <w:rPr>
-          <w:b/>
-        </w:rPr>
-        <w:t>Leadership:</w:t>
-      </w:r>
-      <w:r>
-        <w:t xml:space="preserve"> team of 7, architecture ownership across products, API design, code review, mentoring</w:t>
+        <w:t xml:space="preserve"> NestJS, Node.js, Python, Java, PySpark, Docker, Kubernetes, AWS, CI/CD</w:t>
       </w:r>
     </w:p>
     <w:p>
@@ -210,12 +180,12 @@
           <w:b/>
           <w:sz w:val="21"/>
         </w:rPr>
-        <w:t>Frontend Architect (Contract), Bluemeteor (formerly Codifyd), remote for US company · Sep 2022 to Oct 2026</w:t>
+        <w:t>Frontend Architect (Contract) | Sep 2022 – Oct 2026</w:t>
       </w:r>
     </w:p>
     <w:p>
       <w:r>
-        <w:t>AI-powered product information and content platform (PIM/PXM/DAM) for manufacturers, distributors and retailers.</w:t>
+        <w:t>Bluemeteor (formerly Codifyd) · Remote for US company · AI product-content platform (PIM/PXM/DAM)</w:t>
       </w:r>
     </w:p>
     <w:p>
@@ -224,7 +194,7 @@
         <w:spacing w:after="20"/>
       </w:pPr>
       <w:r>
-        <w:t xml:space="preserve">Architected and led </w:t>
+        <w:t xml:space="preserve">Led </w:t>
       </w:r>
       <w:r>
         <w:rPr>
@@ -233,7 +203,7 @@
         <w:t>SOP Co-Pilot</w:t>
       </w:r>
       <w:r>
-        <w:t xml:space="preserve"> end to end (Angular client and NestJS service). It answers questions from on-screen context and docs with citations, and plans multi-step actions that run only after the user approves.</w:t>
+        <w:t xml:space="preserve"> end to end, both the Angular client and the NestJS service. It answers with citations and runs multi-step workflows only after the user approves.</w:t>
       </w:r>
     </w:p>
     <w:p>
@@ -242,16 +212,16 @@
         <w:spacing w:after="20"/>
       </w:pPr>
       <w:r>
-        <w:t xml:space="preserve">Designed a </w:t>
+        <w:t xml:space="preserve">Chose a </w:t>
       </w:r>
       <w:r>
         <w:rPr>
           <w:b/>
         </w:rPr>
-        <w:t>plan-first agent architecture</w:t>
+        <w:t>plan-first agent design</w:t>
       </w:r>
       <w:r>
-        <w:t>: a deterministic action catalog generated from the app, risk classes that separate reads from data changes, plan-once approval, re-plan on failure, and an audit ledger. Chosen over free-form tool calling so agents cannot invent steps on enterprise write paths.</w:t>
+        <w:t>: a deterministic action catalog, separate read and write risk classes, re-planning on failure, and an audit ledger per run.</w:t>
       </w:r>
     </w:p>
     <w:p>
@@ -260,7 +230,16 @@
         <w:spacing w:after="20"/>
       </w:pPr>
       <w:r>
-        <w:t>Built the service layer: JWT authorization, rate limits, SSE streaming, policy enforcement, a provider-routed LLM layer with tenant bring-your-own-key, hybrid retrieval, cost metrics and prompt sanitization.</w:t>
+        <w:t xml:space="preserve">Built the </w:t>
+      </w:r>
+      <w:r>
+        <w:rPr>
+          <w:b/>
+        </w:rPr>
+        <w:t>eval harness and release gates</w:t>
+      </w:r>
+      <w:r>
+        <w:t>; it rolled out as an enterprise pilot behind feature flags.</w:t>
       </w:r>
     </w:p>
     <w:p>
@@ -269,16 +248,16 @@
         <w:spacing w:after="20"/>
       </w:pPr>
       <w:r>
-        <w:t xml:space="preserve">Created the </w:t>
+        <w:t xml:space="preserve">Led </w:t>
       </w:r>
       <w:r>
         <w:rPr>
           <w:b/>
         </w:rPr>
-        <w:t>agent evaluation harness</w:t>
+        <w:t>AI-assisted mapping</w:t>
       </w:r>
       <w:r>
-        <w:t xml:space="preserve"> (golden goals, gate pass/fail reports) and security/regression specs that gate releases. Shipped as an enterprise pilot with feature-flag gates in every environment.</w:t>
+        <w:t xml:space="preserve"> across the supplier and retailer apps, replacing field-by-field manual mapping with suggestions, review and bulk accept.</w:t>
       </w:r>
     </w:p>
     <w:p>
@@ -287,16 +266,7 @@
         <w:spacing w:after="20"/>
       </w:pPr>
       <w:r>
-        <w:t xml:space="preserve">Led the </w:t>
-      </w:r>
-      <w:r>
-        <w:rPr>
-          <w:b/>
-        </w:rPr>
-        <w:t>AI-assisted mapping and finalize-mapping</w:t>
-      </w:r>
-      <w:r>
-        <w:t xml:space="preserve"> experience shared by the supplier and retailer apps. It replaced field-by-field manual mapping with AI suggestions, human review and confidence-based bulk accept.</w:t>
+        <w:t>Owned AG Grid Enterprise data screens and multi-environment CDN release pipelines.</w:t>
       </w:r>
     </w:p>
     <w:p>
@@ -314,16 +284,7 @@
         <w:t>multi-minute UI freeze</w:t>
       </w:r>
       <w:r>
-        <w:t>: screen-context reads were making ~551 lookup calls for a region showing at most 40 rows, and scoping reads to the visible region fixed it.</w:t>
-      </w:r>
-    </w:p>
-    <w:p>
-      <w:pPr>
-        <w:pStyle w:val="ListBullet"/>
-        <w:spacing w:after="20"/>
-      </w:pPr>
-      <w:r>
-        <w:t>Owned AG Grid Enterprise screens for submissions, submission details and digital assets, plus the release pipelines from playground to production with CDN deploys and automated release notes.</w:t>
+        <w:t xml:space="preserve"> by scoping ~551 lookup calls down to the 40 visible rows.</w:t>
       </w:r>
     </w:p>
     <w:p>
@@ -336,12 +297,12 @@
           <w:b/>
           <w:sz w:val="21"/>
         </w:rPr>
-        <w:t>Senior Frontend Engineer, Forto GmbH, Berlin, Germany · Sep 2021 to Sep 2022</w:t>
+        <w:t>Senior Frontend Engineer | Sep 2021 – Sep 2022</w:t>
       </w:r>
     </w:p>
     <w:p>
       <w:r>
-        <w:t>Digital freight forwarding / logistics platform.</w:t>
+        <w:t>Forto GmbH · Berlin, Germany · Digital freight forwarding</w:t>
       </w:r>
     </w:p>
     <w:p>
@@ -350,16 +311,7 @@
         <w:spacing w:after="20"/>
       </w:pPr>
       <w:r>
-        <w:t>Relocated to Berlin to join the frontend team of a digital freight-forwarding platform.</w:t>
-      </w:r>
-    </w:p>
-    <w:p>
-      <w:pPr>
-        <w:pStyle w:val="ListBullet"/>
-        <w:spacing w:after="20"/>
-      </w:pPr>
-      <w:r>
-        <w:t>Built frontend features for logistics dashboards, shipment visibility, exception handling and role-based workflows.</w:t>
+        <w:t>Relocated to Berlin on a permanent contract. Built logistics dashboards, shipment visibility, exception handling and role-based workflows.</w:t>
       </w:r>
     </w:p>
     <w:p>
@@ -372,7 +324,12 @@
           <w:b/>
           <w:sz w:val="21"/>
         </w:rPr>
-        <w:t>Team Lead, Codifyd · 2018 to 2021</w:t>
+        <w:t>Team Lead | 2018 – 2021</w:t>
+      </w:r>
+    </w:p>
+    <w:p>
+      <w:r>
+        <w:t>Codifyd · Mumbai, India · Product information management</w:t>
       </w:r>
     </w:p>
     <w:p>
@@ -381,7 +338,7 @@
         <w:spacing w:after="20"/>
       </w:pPr>
       <w:r>
-        <w:t>Led a team of 7 developers and owned frontend architecture across multiple enterprise products: Amaze UI (retailer PIM), Supplier Portal and BridgeWeb.</w:t>
+        <w:t>Led 7 developers and owned frontend architecture across the retailer PIM, the supplier portal and BridgeWeb.</w:t>
       </w:r>
     </w:p>
     <w:p>
@@ -390,16 +347,7 @@
         <w:spacing w:after="20"/>
       </w:pPr>
       <w:r>
-        <w:t>Set technical direction (stack choice, integration contracts, delivery trade-offs) and defined module boundaries for large multi-module Angular applications.</w:t>
-      </w:r>
-    </w:p>
-    <w:p>
-      <w:pPr>
-        <w:pStyle w:val="ListBullet"/>
-        <w:spacing w:after="20"/>
-      </w:pPr>
-      <w:r>
-        <w:t>Sustained production codebases through refactors, regression control and release coordination; partnered with DevOps on CI/CD.</w:t>
+        <w:t>Defined module boundaries for large Angular apps, set integration contracts, and ran release coordination with DevOps.</w:t>
       </w:r>
     </w:p>
     <w:p>
@@ -412,7 +360,12 @@
           <w:b/>
           <w:sz w:val="21"/>
         </w:rPr>
-        <w:t>Earlier experience · 2012 to 2018</w:t>
+        <w:t>Earlier roles | 2012 – 2018</w:t>
+      </w:r>
+    </w:p>
+    <w:p>
+      <w:r>
+        <w:t>Zooty.in, Musafir.com, Verdantis, Capgemini, E10 InfoTech, Aambit Softwares</w:t>
       </w:r>
     </w:p>
     <w:p>
@@ -421,52 +374,7 @@
         <w:spacing w:after="20"/>
       </w:pPr>
       <w:r>
-        <w:rPr>
-          <w:b/>
-        </w:rPr>
-        <w:t>Front-end Expert, Zooty.in</w:t>
-      </w:r>
-      <w:r>
-        <w:t xml:space="preserve"> (2016 to 2018): UI architecture, component boundaries and state ownership for customer-facing products; performance and hardening of live systems.</w:t>
-      </w:r>
-    </w:p>
-    <w:p>
-      <w:pPr>
-        <w:pStyle w:val="ListBullet"/>
-        <w:spacing w:after="20"/>
-      </w:pPr>
-      <w:r>
-        <w:rPr>
-          <w:b/>
-        </w:rPr>
-        <w:t>Lead Front-end Programmer, Musafir.com</w:t>
-      </w:r>
-      <w:r>
-        <w:t xml:space="preserve"> (2015 to 2016): high-traffic travel search, pricing, booking and checkout UI; performance under real traffic.</w:t>
-      </w:r>
-    </w:p>
-    <w:p>
-      <w:pPr>
-        <w:pStyle w:val="ListBullet"/>
-        <w:spacing w:after="20"/>
-      </w:pPr>
-      <w:r>
-        <w:rPr>
-          <w:b/>
-        </w:rPr>
-        <w:t>Senior Front-end Developer, Verdantis</w:t>
-      </w:r>
-      <w:r>
-        <w:t xml:space="preserve"> (2014 to 2015): data-dense enterprise UIs with strict validation.</w:t>
-      </w:r>
-    </w:p>
-    <w:p>
-      <w:pPr>
-        <w:pStyle w:val="ListBullet"/>
-        <w:spacing w:after="20"/>
-      </w:pPr>
-      <w:r>
-        <w:t>Capgemini (freelance), Efurtherance, E10 InfoTech, Aambit Softwares (2012 to 2014).</w:t>
+        <w:t>Progressed from developer to frontend lead, working on high-traffic travel booking, customer-facing products and data-dense enterprise workflows.</w:t>
       </w:r>
     </w:p>
     <w:p>
@@ -482,7 +390,7 @@
           <w:color w:val="1F3A8A"/>
           <w:sz w:val="22"/>
         </w:rPr>
-        <w:t>OPEN-SOURCE &amp; PUBLIC WORK</w:t>
+        <w:t>OPEN SOURCE</w:t>
       </w:r>
     </w:p>
     <w:p>
@@ -532,21 +440,6 @@
     </w:p>
     <w:p>
       <w:pPr>
-        <w:pStyle w:val="ListBullet"/>
-        <w:spacing w:after="20"/>
-      </w:pPr>
-      <w:r>
-        <w:rPr>
-          <w:b/>
-        </w:rPr>
-        <w:t>Agentic-Engineering-Playbook:</w:t>
-      </w:r>
-      <w:r>
-        <w:t xml:space="preserve"> open roadmap for production-grade agents, RAG and MCP tools</w:t>
-      </w:r>
-    </w:p>
-    <w:p>
-      <w:pPr>
         <w:spacing w:before="160" w:after="60"/>
         <w:pBdr>
           <w:bottom w:val="single" w:sz="6" w:space="1" w:color="1F3A8A"/>
@@ -562,8 +455,12 @@
       </w:r>
     </w:p>
     <w:p>
+      <w:pPr>
+        <w:pStyle w:val="ListBullet"/>
+        <w:spacing w:after="20"/>
+      </w:pPr>
       <w:r>
-        <w:t>B.E. Computer Science, Atharva College of Engineering, Mumbai, 2013</w:t>
+        <w:t>B.E. Computer Science · Atharva College of Engineering, Mumbai · 2013</w:t>
       </w:r>
     </w:p>
     <w:sectPr>

</xml_diff>